<commit_message>
Done bai 2 phan 2
</commit_message>
<xml_diff>
--- a/Tuan04/Phần 2.docx
+++ b/Tuan04/Phần 2.docx
@@ -209,6 +209,293 @@
           <w:lang w:val="vi-VN"/>
         </w:rPr>
       </w:pPr>
+      <w:r>
+        <w:rPr>
+          <w:b/>
+          <w:bCs/>
+          <w:sz w:val="28"/>
+          <w:szCs w:val="28"/>
+          <w:lang w:val="vi-VN"/>
+        </w:rPr>
+        <w:drawing>
+          <wp:inline distT="0" distB="0" distL="0" distR="0" wp14:anchorId="2D67479A" wp14:editId="6E32B9AE">
+            <wp:extent cx="3771900" cy="1790700"/>
+            <wp:effectExtent l="0" t="0" r="0" b="0"/>
+            <wp:docPr id="1207544683" name="Picture 1"/>
+            <wp:cNvGraphicFramePr>
+              <a:graphicFrameLocks xmlns:a="http://schemas.openxmlformats.org/drawingml/2006/main" noChangeAspect="1"/>
+            </wp:cNvGraphicFramePr>
+            <a:graphic xmlns:a="http://schemas.openxmlformats.org/drawingml/2006/main">
+              <a:graphicData uri="http://schemas.openxmlformats.org/drawingml/2006/picture">
+                <pic:pic xmlns:pic="http://schemas.openxmlformats.org/drawingml/2006/picture">
+                  <pic:nvPicPr>
+                    <pic:cNvPr id="1207544683" name=""/>
+                    <pic:cNvPicPr/>
+                  </pic:nvPicPr>
+                  <pic:blipFill>
+                    <a:blip r:embed="rId7"/>
+                    <a:stretch>
+                      <a:fillRect/>
+                    </a:stretch>
+                  </pic:blipFill>
+                  <pic:spPr>
+                    <a:xfrm>
+                      <a:off x="0" y="0"/>
+                      <a:ext cx="3771900" cy="1790700"/>
+                    </a:xfrm>
+                    <a:prstGeom prst="rect">
+                      <a:avLst/>
+                    </a:prstGeom>
+                  </pic:spPr>
+                </pic:pic>
+              </a:graphicData>
+            </a:graphic>
+          </wp:inline>
+        </w:drawing>
+      </w:r>
+    </w:p>
+    <w:p>
+      <w:pPr>
+        <w:rPr>
+          <w:b/>
+          <w:bCs/>
+          <w:sz w:val="28"/>
+          <w:szCs w:val="28"/>
+          <w:lang w:val="vi-VN"/>
+        </w:rPr>
+      </w:pPr>
+      <w:r>
+        <w:rPr>
+          <w:b/>
+          <w:bCs/>
+          <w:sz w:val="28"/>
+          <w:szCs w:val="28"/>
+          <w:lang w:val="vi-VN"/>
+        </w:rPr>
+        <w:t>Bài 2:</w:t>
+      </w:r>
+    </w:p>
+    <w:p>
+      <w:pPr>
+        <w:rPr>
+          <w:b/>
+          <w:bCs/>
+          <w:sz w:val="28"/>
+          <w:szCs w:val="28"/>
+          <w:lang w:val="vi-VN"/>
+        </w:rPr>
+      </w:pPr>
+      <w:r>
+        <w:rPr>
+          <w:b/>
+          <w:bCs/>
+          <w:sz w:val="28"/>
+          <w:szCs w:val="28"/>
+          <w:lang w:val="vi-VN"/>
+        </w:rPr>
+        <w:lastRenderedPageBreak/>
+        <w:drawing>
+          <wp:inline distT="0" distB="0" distL="0" distR="0" wp14:anchorId="678A7D6E" wp14:editId="18346ABE">
+            <wp:extent cx="5943600" cy="4742180"/>
+            <wp:effectExtent l="0" t="0" r="0" b="0"/>
+            <wp:docPr id="49820112" name="Picture 1"/>
+            <wp:cNvGraphicFramePr>
+              <a:graphicFrameLocks xmlns:a="http://schemas.openxmlformats.org/drawingml/2006/main" noChangeAspect="1"/>
+            </wp:cNvGraphicFramePr>
+            <a:graphic xmlns:a="http://schemas.openxmlformats.org/drawingml/2006/main">
+              <a:graphicData uri="http://schemas.openxmlformats.org/drawingml/2006/picture">
+                <pic:pic xmlns:pic="http://schemas.openxmlformats.org/drawingml/2006/picture">
+                  <pic:nvPicPr>
+                    <pic:cNvPr id="49820112" name=""/>
+                    <pic:cNvPicPr/>
+                  </pic:nvPicPr>
+                  <pic:blipFill>
+                    <a:blip r:embed="rId8"/>
+                    <a:stretch>
+                      <a:fillRect/>
+                    </a:stretch>
+                  </pic:blipFill>
+                  <pic:spPr>
+                    <a:xfrm>
+                      <a:off x="0" y="0"/>
+                      <a:ext cx="5943600" cy="4742180"/>
+                    </a:xfrm>
+                    <a:prstGeom prst="rect">
+                      <a:avLst/>
+                    </a:prstGeom>
+                  </pic:spPr>
+                </pic:pic>
+              </a:graphicData>
+            </a:graphic>
+          </wp:inline>
+        </w:drawing>
+      </w:r>
+    </w:p>
+    <w:p>
+      <w:pPr>
+        <w:rPr>
+          <w:b/>
+          <w:bCs/>
+          <w:sz w:val="28"/>
+          <w:szCs w:val="28"/>
+          <w:lang w:val="vi-VN"/>
+        </w:rPr>
+      </w:pPr>
+      <w:r>
+        <w:rPr>
+          <w:b/>
+          <w:bCs/>
+          <w:sz w:val="28"/>
+          <w:szCs w:val="28"/>
+          <w:lang w:val="vi-VN"/>
+        </w:rPr>
+        <w:drawing>
+          <wp:inline distT="0" distB="0" distL="0" distR="0" wp14:anchorId="56E102D4" wp14:editId="22390BF3">
+            <wp:extent cx="5943600" cy="2887980"/>
+            <wp:effectExtent l="0" t="0" r="0" b="0"/>
+            <wp:docPr id="1906792464" name="Picture 1"/>
+            <wp:cNvGraphicFramePr>
+              <a:graphicFrameLocks xmlns:a="http://schemas.openxmlformats.org/drawingml/2006/main" noChangeAspect="1"/>
+            </wp:cNvGraphicFramePr>
+            <a:graphic xmlns:a="http://schemas.openxmlformats.org/drawingml/2006/main">
+              <a:graphicData uri="http://schemas.openxmlformats.org/drawingml/2006/picture">
+                <pic:pic xmlns:pic="http://schemas.openxmlformats.org/drawingml/2006/picture">
+                  <pic:nvPicPr>
+                    <pic:cNvPr id="1906792464" name=""/>
+                    <pic:cNvPicPr/>
+                  </pic:nvPicPr>
+                  <pic:blipFill>
+                    <a:blip r:embed="rId9"/>
+                    <a:stretch>
+                      <a:fillRect/>
+                    </a:stretch>
+                  </pic:blipFill>
+                  <pic:spPr>
+                    <a:xfrm>
+                      <a:off x="0" y="0"/>
+                      <a:ext cx="5943600" cy="2887980"/>
+                    </a:xfrm>
+                    <a:prstGeom prst="rect">
+                      <a:avLst/>
+                    </a:prstGeom>
+                  </pic:spPr>
+                </pic:pic>
+              </a:graphicData>
+            </a:graphic>
+          </wp:inline>
+        </w:drawing>
+      </w:r>
+    </w:p>
+    <w:p>
+      <w:pPr>
+        <w:rPr>
+          <w:b/>
+          <w:bCs/>
+          <w:sz w:val="28"/>
+          <w:szCs w:val="28"/>
+          <w:lang w:val="vi-VN"/>
+        </w:rPr>
+      </w:pPr>
+      <w:r>
+        <w:rPr>
+          <w:b/>
+          <w:bCs/>
+          <w:sz w:val="28"/>
+          <w:szCs w:val="28"/>
+          <w:lang w:val="vi-VN"/>
+        </w:rPr>
+        <w:lastRenderedPageBreak/>
+        <w:drawing>
+          <wp:inline distT="0" distB="0" distL="0" distR="0" wp14:anchorId="1D27E49B" wp14:editId="54F25BA2">
+            <wp:extent cx="5943600" cy="4004310"/>
+            <wp:effectExtent l="0" t="0" r="0" b="0"/>
+            <wp:docPr id="1539872794" name="Picture 1"/>
+            <wp:cNvGraphicFramePr>
+              <a:graphicFrameLocks xmlns:a="http://schemas.openxmlformats.org/drawingml/2006/main" noChangeAspect="1"/>
+            </wp:cNvGraphicFramePr>
+            <a:graphic xmlns:a="http://schemas.openxmlformats.org/drawingml/2006/main">
+              <a:graphicData uri="http://schemas.openxmlformats.org/drawingml/2006/picture">
+                <pic:pic xmlns:pic="http://schemas.openxmlformats.org/drawingml/2006/picture">
+                  <pic:nvPicPr>
+                    <pic:cNvPr id="1539872794" name=""/>
+                    <pic:cNvPicPr/>
+                  </pic:nvPicPr>
+                  <pic:blipFill>
+                    <a:blip r:embed="rId10"/>
+                    <a:stretch>
+                      <a:fillRect/>
+                    </a:stretch>
+                  </pic:blipFill>
+                  <pic:spPr>
+                    <a:xfrm>
+                      <a:off x="0" y="0"/>
+                      <a:ext cx="5943600" cy="4004310"/>
+                    </a:xfrm>
+                    <a:prstGeom prst="rect">
+                      <a:avLst/>
+                    </a:prstGeom>
+                  </pic:spPr>
+                </pic:pic>
+              </a:graphicData>
+            </a:graphic>
+          </wp:inline>
+        </w:drawing>
+      </w:r>
+    </w:p>
+    <w:p>
+      <w:pPr>
+        <w:rPr>
+          <w:b/>
+          <w:bCs/>
+          <w:sz w:val="28"/>
+          <w:szCs w:val="28"/>
+          <w:lang w:val="vi-VN"/>
+        </w:rPr>
+      </w:pPr>
+      <w:r>
+        <w:rPr>
+          <w:b/>
+          <w:bCs/>
+          <w:sz w:val="28"/>
+          <w:szCs w:val="28"/>
+          <w:lang w:val="vi-VN"/>
+        </w:rPr>
+        <w:drawing>
+          <wp:inline distT="0" distB="0" distL="0" distR="0" wp14:anchorId="738DE4EF" wp14:editId="259494FE">
+            <wp:extent cx="3365500" cy="1562100"/>
+            <wp:effectExtent l="0" t="0" r="0" b="0"/>
+            <wp:docPr id="550850834" name="Picture 1"/>
+            <wp:cNvGraphicFramePr>
+              <a:graphicFrameLocks xmlns:a="http://schemas.openxmlformats.org/drawingml/2006/main" noChangeAspect="1"/>
+            </wp:cNvGraphicFramePr>
+            <a:graphic xmlns:a="http://schemas.openxmlformats.org/drawingml/2006/main">
+              <a:graphicData uri="http://schemas.openxmlformats.org/drawingml/2006/picture">
+                <pic:pic xmlns:pic="http://schemas.openxmlformats.org/drawingml/2006/picture">
+                  <pic:nvPicPr>
+                    <pic:cNvPr id="550850834" name=""/>
+                    <pic:cNvPicPr/>
+                  </pic:nvPicPr>
+                  <pic:blipFill>
+                    <a:blip r:embed="rId11"/>
+                    <a:stretch>
+                      <a:fillRect/>
+                    </a:stretch>
+                  </pic:blipFill>
+                  <pic:spPr>
+                    <a:xfrm>
+                      <a:off x="0" y="0"/>
+                      <a:ext cx="3365500" cy="1562100"/>
+                    </a:xfrm>
+                    <a:prstGeom prst="rect">
+                      <a:avLst/>
+                    </a:prstGeom>
+                  </pic:spPr>
+                </pic:pic>
+              </a:graphicData>
+            </a:graphic>
+          </wp:inline>
+        </w:drawing>
+      </w:r>
     </w:p>
     <w:p>
       <w:pPr>

</xml_diff>

<commit_message>
Done bai 3 phan 2
</commit_message>
<xml_diff>
--- a/Tuan04/Phần 2.docx
+++ b/Tuan04/Phần 2.docx
@@ -507,6 +507,127 @@
           <w:lang w:val="vi-VN"/>
         </w:rPr>
       </w:pPr>
+      <w:r>
+        <w:rPr>
+          <w:b/>
+          <w:bCs/>
+          <w:sz w:val="28"/>
+          <w:szCs w:val="28"/>
+          <w:lang w:val="vi-VN"/>
+        </w:rPr>
+        <w:t>Bài 3:</w:t>
+      </w:r>
+    </w:p>
+    <w:p>
+      <w:pPr>
+        <w:rPr>
+          <w:b/>
+          <w:bCs/>
+          <w:sz w:val="28"/>
+          <w:szCs w:val="28"/>
+          <w:lang w:val="vi-VN"/>
+        </w:rPr>
+      </w:pPr>
+      <w:r>
+        <w:rPr>
+          <w:b/>
+          <w:bCs/>
+          <w:sz w:val="28"/>
+          <w:szCs w:val="28"/>
+          <w:lang w:val="vi-VN"/>
+        </w:rPr>
+        <w:lastRenderedPageBreak/>
+        <w:drawing>
+          <wp:inline distT="0" distB="0" distL="0" distR="0" wp14:anchorId="5DD94C16" wp14:editId="3BD96DA9">
+            <wp:extent cx="5943600" cy="3714750"/>
+            <wp:effectExtent l="0" t="0" r="0" b="6350"/>
+            <wp:docPr id="804616558" name="Picture 1"/>
+            <wp:cNvGraphicFramePr>
+              <a:graphicFrameLocks xmlns:a="http://schemas.openxmlformats.org/drawingml/2006/main" noChangeAspect="1"/>
+            </wp:cNvGraphicFramePr>
+            <a:graphic xmlns:a="http://schemas.openxmlformats.org/drawingml/2006/main">
+              <a:graphicData uri="http://schemas.openxmlformats.org/drawingml/2006/picture">
+                <pic:pic xmlns:pic="http://schemas.openxmlformats.org/drawingml/2006/picture">
+                  <pic:nvPicPr>
+                    <pic:cNvPr id="804616558" name=""/>
+                    <pic:cNvPicPr/>
+                  </pic:nvPicPr>
+                  <pic:blipFill>
+                    <a:blip r:embed="rId12"/>
+                    <a:stretch>
+                      <a:fillRect/>
+                    </a:stretch>
+                  </pic:blipFill>
+                  <pic:spPr>
+                    <a:xfrm>
+                      <a:off x="0" y="0"/>
+                      <a:ext cx="5943600" cy="3714750"/>
+                    </a:xfrm>
+                    <a:prstGeom prst="rect">
+                      <a:avLst/>
+                    </a:prstGeom>
+                  </pic:spPr>
+                </pic:pic>
+              </a:graphicData>
+            </a:graphic>
+          </wp:inline>
+        </w:drawing>
+      </w:r>
+    </w:p>
+    <w:p>
+      <w:pPr>
+        <w:rPr>
+          <w:b/>
+          <w:bCs/>
+          <w:sz w:val="28"/>
+          <w:szCs w:val="28"/>
+          <w:lang w:val="vi-VN"/>
+        </w:rPr>
+      </w:pPr>
+      <w:r>
+        <w:rPr>
+          <w:b/>
+          <w:bCs/>
+          <w:sz w:val="28"/>
+          <w:szCs w:val="28"/>
+          <w:lang w:val="vi-VN"/>
+        </w:rPr>
+        <w:drawing>
+          <wp:inline distT="0" distB="0" distL="0" distR="0" wp14:anchorId="314AB0E5" wp14:editId="6A15012D">
+            <wp:extent cx="5943600" cy="3185160"/>
+            <wp:effectExtent l="0" t="0" r="0" b="2540"/>
+            <wp:docPr id="1504010551" name="Picture 1"/>
+            <wp:cNvGraphicFramePr>
+              <a:graphicFrameLocks xmlns:a="http://schemas.openxmlformats.org/drawingml/2006/main" noChangeAspect="1"/>
+            </wp:cNvGraphicFramePr>
+            <a:graphic xmlns:a="http://schemas.openxmlformats.org/drawingml/2006/main">
+              <a:graphicData uri="http://schemas.openxmlformats.org/drawingml/2006/picture">
+                <pic:pic xmlns:pic="http://schemas.openxmlformats.org/drawingml/2006/picture">
+                  <pic:nvPicPr>
+                    <pic:cNvPr id="1504010551" name=""/>
+                    <pic:cNvPicPr/>
+                  </pic:nvPicPr>
+                  <pic:blipFill>
+                    <a:blip r:embed="rId13"/>
+                    <a:stretch>
+                      <a:fillRect/>
+                    </a:stretch>
+                  </pic:blipFill>
+                  <pic:spPr>
+                    <a:xfrm>
+                      <a:off x="0" y="0"/>
+                      <a:ext cx="5943600" cy="3185160"/>
+                    </a:xfrm>
+                    <a:prstGeom prst="rect">
+                      <a:avLst/>
+                    </a:prstGeom>
+                  </pic:spPr>
+                </pic:pic>
+              </a:graphicData>
+            </a:graphic>
+          </wp:inline>
+        </w:drawing>
+      </w:r>
     </w:p>
     <w:sectPr>
       <w:pgSz w:w="12240" w:h="15840"/>

</xml_diff>

<commit_message>
Done bai 5 phan 2
</commit_message>
<xml_diff>
--- a/Tuan04/Phần 2.docx
+++ b/Tuan04/Phần 2.docx
@@ -815,6 +815,216 @@
                     <a:xfrm>
                       <a:off x="0" y="0"/>
                       <a:ext cx="5943600" cy="1190625"/>
+                    </a:xfrm>
+                    <a:prstGeom prst="rect">
+                      <a:avLst/>
+                    </a:prstGeom>
+                  </pic:spPr>
+                </pic:pic>
+              </a:graphicData>
+            </a:graphic>
+          </wp:inline>
+        </w:drawing>
+      </w:r>
+    </w:p>
+    <w:p>
+      <w:pPr>
+        <w:rPr>
+          <w:b/>
+          <w:bCs/>
+          <w:sz w:val="28"/>
+          <w:szCs w:val="28"/>
+          <w:lang w:val="vi-VN"/>
+        </w:rPr>
+      </w:pPr>
+    </w:p>
+    <w:p>
+      <w:pPr>
+        <w:rPr>
+          <w:b/>
+          <w:bCs/>
+          <w:sz w:val="28"/>
+          <w:szCs w:val="28"/>
+          <w:lang w:val="vi-VN"/>
+        </w:rPr>
+      </w:pPr>
+    </w:p>
+    <w:p>
+      <w:pPr>
+        <w:rPr>
+          <w:b/>
+          <w:bCs/>
+          <w:sz w:val="28"/>
+          <w:szCs w:val="28"/>
+          <w:lang w:val="vi-VN"/>
+        </w:rPr>
+      </w:pPr>
+      <w:r>
+        <w:rPr>
+          <w:b/>
+          <w:bCs/>
+          <w:sz w:val="28"/>
+          <w:szCs w:val="28"/>
+          <w:lang w:val="vi-VN"/>
+        </w:rPr>
+        <w:lastRenderedPageBreak/>
+        <w:t>Bài 5:</w:t>
+      </w:r>
+    </w:p>
+    <w:p>
+      <w:pPr>
+        <w:rPr>
+          <w:b/>
+          <w:bCs/>
+          <w:sz w:val="28"/>
+          <w:szCs w:val="28"/>
+          <w:lang w:val="vi-VN"/>
+        </w:rPr>
+      </w:pPr>
+      <w:r>
+        <w:rPr>
+          <w:b/>
+          <w:bCs/>
+          <w:sz w:val="28"/>
+          <w:szCs w:val="28"/>
+          <w:lang w:val="vi-VN"/>
+        </w:rPr>
+        <w:drawing>
+          <wp:inline distT="0" distB="0" distL="0" distR="0" wp14:anchorId="3870DA61" wp14:editId="2152B94C">
+            <wp:extent cx="5943600" cy="4184015"/>
+            <wp:effectExtent l="0" t="0" r="0" b="0"/>
+            <wp:docPr id="1596511545" name="Picture 1"/>
+            <wp:cNvGraphicFramePr>
+              <a:graphicFrameLocks xmlns:a="http://schemas.openxmlformats.org/drawingml/2006/main" noChangeAspect="1"/>
+            </wp:cNvGraphicFramePr>
+            <a:graphic xmlns:a="http://schemas.openxmlformats.org/drawingml/2006/main">
+              <a:graphicData uri="http://schemas.openxmlformats.org/drawingml/2006/picture">
+                <pic:pic xmlns:pic="http://schemas.openxmlformats.org/drawingml/2006/picture">
+                  <pic:nvPicPr>
+                    <pic:cNvPr id="1596511545" name=""/>
+                    <pic:cNvPicPr/>
+                  </pic:nvPicPr>
+                  <pic:blipFill>
+                    <a:blip r:embed="rId17"/>
+                    <a:stretch>
+                      <a:fillRect/>
+                    </a:stretch>
+                  </pic:blipFill>
+                  <pic:spPr>
+                    <a:xfrm>
+                      <a:off x="0" y="0"/>
+                      <a:ext cx="5943600" cy="4184015"/>
+                    </a:xfrm>
+                    <a:prstGeom prst="rect">
+                      <a:avLst/>
+                    </a:prstGeom>
+                  </pic:spPr>
+                </pic:pic>
+              </a:graphicData>
+            </a:graphic>
+          </wp:inline>
+        </w:drawing>
+      </w:r>
+    </w:p>
+    <w:p>
+      <w:pPr>
+        <w:rPr>
+          <w:b/>
+          <w:bCs/>
+          <w:sz w:val="28"/>
+          <w:szCs w:val="28"/>
+          <w:lang w:val="vi-VN"/>
+        </w:rPr>
+      </w:pPr>
+      <w:r>
+        <w:rPr>
+          <w:b/>
+          <w:bCs/>
+          <w:sz w:val="28"/>
+          <w:szCs w:val="28"/>
+          <w:lang w:val="vi-VN"/>
+        </w:rPr>
+        <w:lastRenderedPageBreak/>
+        <w:drawing>
+          <wp:inline distT="0" distB="0" distL="0" distR="0" wp14:anchorId="28C89D21" wp14:editId="619B51D2">
+            <wp:extent cx="5943600" cy="3714750"/>
+            <wp:effectExtent l="0" t="0" r="0" b="6350"/>
+            <wp:docPr id="416533734" name="Picture 1"/>
+            <wp:cNvGraphicFramePr>
+              <a:graphicFrameLocks xmlns:a="http://schemas.openxmlformats.org/drawingml/2006/main" noChangeAspect="1"/>
+            </wp:cNvGraphicFramePr>
+            <a:graphic xmlns:a="http://schemas.openxmlformats.org/drawingml/2006/main">
+              <a:graphicData uri="http://schemas.openxmlformats.org/drawingml/2006/picture">
+                <pic:pic xmlns:pic="http://schemas.openxmlformats.org/drawingml/2006/picture">
+                  <pic:nvPicPr>
+                    <pic:cNvPr id="416533734" name=""/>
+                    <pic:cNvPicPr/>
+                  </pic:nvPicPr>
+                  <pic:blipFill>
+                    <a:blip r:embed="rId18"/>
+                    <a:stretch>
+                      <a:fillRect/>
+                    </a:stretch>
+                  </pic:blipFill>
+                  <pic:spPr>
+                    <a:xfrm>
+                      <a:off x="0" y="0"/>
+                      <a:ext cx="5943600" cy="3714750"/>
+                    </a:xfrm>
+                    <a:prstGeom prst="rect">
+                      <a:avLst/>
+                    </a:prstGeom>
+                  </pic:spPr>
+                </pic:pic>
+              </a:graphicData>
+            </a:graphic>
+          </wp:inline>
+        </w:drawing>
+      </w:r>
+    </w:p>
+    <w:p>
+      <w:pPr>
+        <w:rPr>
+          <w:b/>
+          <w:bCs/>
+          <w:sz w:val="28"/>
+          <w:szCs w:val="28"/>
+          <w:lang w:val="vi-VN"/>
+        </w:rPr>
+      </w:pPr>
+      <w:r>
+        <w:rPr>
+          <w:b/>
+          <w:bCs/>
+          <w:sz w:val="28"/>
+          <w:szCs w:val="28"/>
+          <w:lang w:val="vi-VN"/>
+        </w:rPr>
+        <w:drawing>
+          <wp:inline distT="0" distB="0" distL="0" distR="0" wp14:anchorId="17F952EC" wp14:editId="52EEE82C">
+            <wp:extent cx="5829300" cy="1993900"/>
+            <wp:effectExtent l="0" t="0" r="0" b="0"/>
+            <wp:docPr id="653523386" name="Picture 1"/>
+            <wp:cNvGraphicFramePr>
+              <a:graphicFrameLocks xmlns:a="http://schemas.openxmlformats.org/drawingml/2006/main" noChangeAspect="1"/>
+            </wp:cNvGraphicFramePr>
+            <a:graphic xmlns:a="http://schemas.openxmlformats.org/drawingml/2006/main">
+              <a:graphicData uri="http://schemas.openxmlformats.org/drawingml/2006/picture">
+                <pic:pic xmlns:pic="http://schemas.openxmlformats.org/drawingml/2006/picture">
+                  <pic:nvPicPr>
+                    <pic:cNvPr id="653523386" name=""/>
+                    <pic:cNvPicPr/>
+                  </pic:nvPicPr>
+                  <pic:blipFill>
+                    <a:blip r:embed="rId19"/>
+                    <a:stretch>
+                      <a:fillRect/>
+                    </a:stretch>
+                  </pic:blipFill>
+                  <pic:spPr>
+                    <a:xfrm>
+                      <a:off x="0" y="0"/>
+                      <a:ext cx="5829300" cy="1993900"/>
                     </a:xfrm>
                     <a:prstGeom prst="rect">
                       <a:avLst/>

</xml_diff>

<commit_message>
Done bai 6 phan 2
</commit_message>
<xml_diff>
--- a/Tuan04/Phần 2.docx
+++ b/Tuan04/Phần 2.docx
@@ -1025,6 +1025,194 @@
                     <a:xfrm>
                       <a:off x="0" y="0"/>
                       <a:ext cx="5829300" cy="1993900"/>
+                    </a:xfrm>
+                    <a:prstGeom prst="rect">
+                      <a:avLst/>
+                    </a:prstGeom>
+                  </pic:spPr>
+                </pic:pic>
+              </a:graphicData>
+            </a:graphic>
+          </wp:inline>
+        </w:drawing>
+      </w:r>
+    </w:p>
+    <w:p>
+      <w:pPr>
+        <w:rPr>
+          <w:b/>
+          <w:bCs/>
+          <w:sz w:val="28"/>
+          <w:szCs w:val="28"/>
+          <w:lang w:val="vi-VN"/>
+        </w:rPr>
+      </w:pPr>
+      <w:r>
+        <w:rPr>
+          <w:b/>
+          <w:bCs/>
+          <w:sz w:val="28"/>
+          <w:szCs w:val="28"/>
+          <w:lang w:val="vi-VN"/>
+        </w:rPr>
+        <w:t>Bài 6:</w:t>
+      </w:r>
+    </w:p>
+    <w:p>
+      <w:pPr>
+        <w:rPr>
+          <w:b/>
+          <w:bCs/>
+          <w:sz w:val="28"/>
+          <w:szCs w:val="28"/>
+          <w:lang w:val="vi-VN"/>
+        </w:rPr>
+      </w:pPr>
+      <w:r>
+        <w:rPr>
+          <w:b/>
+          <w:bCs/>
+          <w:sz w:val="28"/>
+          <w:szCs w:val="28"/>
+          <w:lang w:val="vi-VN"/>
+        </w:rPr>
+        <w:lastRenderedPageBreak/>
+        <w:drawing>
+          <wp:inline distT="0" distB="0" distL="0" distR="0" wp14:anchorId="322E0D2E" wp14:editId="2CBC4972">
+            <wp:extent cx="5943600" cy="4657090"/>
+            <wp:effectExtent l="0" t="0" r="0" b="3810"/>
+            <wp:docPr id="79078963" name="Picture 1"/>
+            <wp:cNvGraphicFramePr>
+              <a:graphicFrameLocks xmlns:a="http://schemas.openxmlformats.org/drawingml/2006/main" noChangeAspect="1"/>
+            </wp:cNvGraphicFramePr>
+            <a:graphic xmlns:a="http://schemas.openxmlformats.org/drawingml/2006/main">
+              <a:graphicData uri="http://schemas.openxmlformats.org/drawingml/2006/picture">
+                <pic:pic xmlns:pic="http://schemas.openxmlformats.org/drawingml/2006/picture">
+                  <pic:nvPicPr>
+                    <pic:cNvPr id="79078963" name=""/>
+                    <pic:cNvPicPr/>
+                  </pic:nvPicPr>
+                  <pic:blipFill>
+                    <a:blip r:embed="rId20"/>
+                    <a:stretch>
+                      <a:fillRect/>
+                    </a:stretch>
+                  </pic:blipFill>
+                  <pic:spPr>
+                    <a:xfrm>
+                      <a:off x="0" y="0"/>
+                      <a:ext cx="5943600" cy="4657090"/>
+                    </a:xfrm>
+                    <a:prstGeom prst="rect">
+                      <a:avLst/>
+                    </a:prstGeom>
+                  </pic:spPr>
+                </pic:pic>
+              </a:graphicData>
+            </a:graphic>
+          </wp:inline>
+        </w:drawing>
+      </w:r>
+    </w:p>
+    <w:p>
+      <w:pPr>
+        <w:rPr>
+          <w:b/>
+          <w:bCs/>
+          <w:sz w:val="28"/>
+          <w:szCs w:val="28"/>
+          <w:lang w:val="vi-VN"/>
+        </w:rPr>
+      </w:pPr>
+      <w:r>
+        <w:rPr>
+          <w:b/>
+          <w:bCs/>
+          <w:sz w:val="28"/>
+          <w:szCs w:val="28"/>
+          <w:lang w:val="vi-VN"/>
+        </w:rPr>
+        <w:lastRenderedPageBreak/>
+        <w:drawing>
+          <wp:inline distT="0" distB="0" distL="0" distR="0" wp14:anchorId="60230899" wp14:editId="4EAFA5DA">
+            <wp:extent cx="5943600" cy="3714750"/>
+            <wp:effectExtent l="0" t="0" r="0" b="6350"/>
+            <wp:docPr id="286915312" name="Picture 1"/>
+            <wp:cNvGraphicFramePr>
+              <a:graphicFrameLocks xmlns:a="http://schemas.openxmlformats.org/drawingml/2006/main" noChangeAspect="1"/>
+            </wp:cNvGraphicFramePr>
+            <a:graphic xmlns:a="http://schemas.openxmlformats.org/drawingml/2006/main">
+              <a:graphicData uri="http://schemas.openxmlformats.org/drawingml/2006/picture">
+                <pic:pic xmlns:pic="http://schemas.openxmlformats.org/drawingml/2006/picture">
+                  <pic:nvPicPr>
+                    <pic:cNvPr id="286915312" name=""/>
+                    <pic:cNvPicPr/>
+                  </pic:nvPicPr>
+                  <pic:blipFill>
+                    <a:blip r:embed="rId21"/>
+                    <a:stretch>
+                      <a:fillRect/>
+                    </a:stretch>
+                  </pic:blipFill>
+                  <pic:spPr>
+                    <a:xfrm>
+                      <a:off x="0" y="0"/>
+                      <a:ext cx="5943600" cy="3714750"/>
+                    </a:xfrm>
+                    <a:prstGeom prst="rect">
+                      <a:avLst/>
+                    </a:prstGeom>
+                  </pic:spPr>
+                </pic:pic>
+              </a:graphicData>
+            </a:graphic>
+          </wp:inline>
+        </w:drawing>
+      </w:r>
+    </w:p>
+    <w:p>
+      <w:pPr>
+        <w:rPr>
+          <w:b/>
+          <w:bCs/>
+          <w:sz w:val="28"/>
+          <w:szCs w:val="28"/>
+          <w:lang w:val="vi-VN"/>
+        </w:rPr>
+      </w:pPr>
+      <w:r>
+        <w:rPr>
+          <w:b/>
+          <w:bCs/>
+          <w:sz w:val="28"/>
+          <w:szCs w:val="28"/>
+          <w:lang w:val="vi-VN"/>
+        </w:rPr>
+        <w:drawing>
+          <wp:inline distT="0" distB="0" distL="0" distR="0" wp14:anchorId="20F50F9C" wp14:editId="74648712">
+            <wp:extent cx="4229100" cy="1790700"/>
+            <wp:effectExtent l="0" t="0" r="0" b="0"/>
+            <wp:docPr id="1856599260" name="Picture 1"/>
+            <wp:cNvGraphicFramePr>
+              <a:graphicFrameLocks xmlns:a="http://schemas.openxmlformats.org/drawingml/2006/main" noChangeAspect="1"/>
+            </wp:cNvGraphicFramePr>
+            <a:graphic xmlns:a="http://schemas.openxmlformats.org/drawingml/2006/main">
+              <a:graphicData uri="http://schemas.openxmlformats.org/drawingml/2006/picture">
+                <pic:pic xmlns:pic="http://schemas.openxmlformats.org/drawingml/2006/picture">
+                  <pic:nvPicPr>
+                    <pic:cNvPr id="1856599260" name=""/>
+                    <pic:cNvPicPr/>
+                  </pic:nvPicPr>
+                  <pic:blipFill>
+                    <a:blip r:embed="rId22"/>
+                    <a:stretch>
+                      <a:fillRect/>
+                    </a:stretch>
+                  </pic:blipFill>
+                  <pic:spPr>
+                    <a:xfrm>
+                      <a:off x="0" y="0"/>
+                      <a:ext cx="4229100" cy="1790700"/>
                     </a:xfrm>
                     <a:prstGeom prst="rect">
                       <a:avLst/>

</xml_diff>